<commit_message>
docs: embed professional exploratory charts for Class Notebook
</commit_message>
<xml_diff>
--- a/Redaccion_Class_Notebook_DataShop.docx
+++ b/Redaccion_Class_Notebook_DataShop.docx
@@ -1348,6 +1348,339 @@
         <w:t>El archivo original no estaba listo para aplicar algoritmos de Data Mining por errores de dominio, valores faltantes, identificadores repetidos e inconsistencias de texto. Después de una limpieza controlada y reproducible, se obtuvo una base de 50 clientes únicos sin faltantes ni valores imposibles. Como siguiente etapa se recomienda escalar las variables numéricas, codificar las categorías y evaluar una segmentación con K-Means mediante los criterios de codo y silhouette.</w:t>
       </w:r>
     </w:p>
+    <w:p>
+      <w:r>
+        <w:br w:type="page"/>
+      </w:r>
+    </w:p>
+    <w:p>
+      <w:pPr>
+        <w:pStyle w:val="Heading1"/>
+      </w:pPr>
+      <w:r>
+        <w:t>Evidencia gráfica del análisis exploratorio</w:t>
+      </w:r>
+    </w:p>
+    <w:p>
+      <w:r>
+        <w:t>Las siguientes gráficas se elaboraron sobre el dataframe limpio de 50 clientes únicos. Cada visualización responde a una de las preguntas solicitadas en la práctica.</w:t>
+      </w:r>
+    </w:p>
+    <w:p>
+      <w:pPr>
+        <w:pStyle w:val="Heading2"/>
+        <w:keepNext/>
+      </w:pPr>
+      <w:r>
+        <w:t>Figura 1. Distribución de edades</w:t>
+      </w:r>
+    </w:p>
+    <w:p>
+      <w:pPr>
+        <w:spacing w:after="120"/>
+        <w:jc w:val="center"/>
+      </w:pPr>
+      <w:r>
+        <w:drawing>
+          <wp:inline xmlns:a="http://schemas.openxmlformats.org/drawingml/2006/main" xmlns:pic="http://schemas.openxmlformats.org/drawingml/2006/picture">
+            <wp:extent cx="5715000" cy="3048435"/>
+            <wp:docPr id="1" name="Picture 1"/>
+            <wp:cNvGraphicFramePr>
+              <a:graphicFrameLocks noChangeAspect="1"/>
+            </wp:cNvGraphicFramePr>
+            <a:graphic>
+              <a:graphicData uri="http://schemas.openxmlformats.org/drawingml/2006/picture">
+                <pic:pic>
+                  <pic:nvPicPr>
+                    <pic:cNvPr id="0" name="grafica_1_edades.png"/>
+                    <pic:cNvPicPr/>
+                  </pic:nvPicPr>
+                  <pic:blipFill>
+                    <a:blip r:embed="rId10"/>
+                    <a:stretch>
+                      <a:fillRect/>
+                    </a:stretch>
+                  </pic:blipFill>
+                  <pic:spPr>
+                    <a:xfrm>
+                      <a:off x="0" y="0"/>
+                      <a:ext cx="5715000" cy="3048435"/>
+                    </a:xfrm>
+                    <a:prstGeom prst="rect"/>
+                  </pic:spPr>
+                </pic:pic>
+              </a:graphicData>
+            </a:graphic>
+          </wp:inline>
+        </w:drawing>
+      </w:r>
+    </w:p>
+    <w:p>
+      <w:pPr>
+        <w:spacing w:after="240"/>
+      </w:pPr>
+      <w:r>
+        <w:rPr>
+          <w:b/>
+        </w:rPr>
+        <w:t xml:space="preserve">Interpretación: </w:t>
+      </w:r>
+      <w:r>
+        <w:t>El intervalo de 35 a 44 años es el más frecuente. La concentración principal se ubica entre 25 y 45 años.</w:t>
+      </w:r>
+    </w:p>
+    <w:p>
+      <w:pPr>
+        <w:pStyle w:val="Heading2"/>
+        <w:keepNext/>
+      </w:pPr>
+      <w:r>
+        <w:t>Figura 2. Frecuencia de compra</w:t>
+      </w:r>
+    </w:p>
+    <w:p>
+      <w:pPr>
+        <w:spacing w:after="120"/>
+        <w:jc w:val="center"/>
+      </w:pPr>
+      <w:r>
+        <w:drawing>
+          <wp:inline xmlns:a="http://schemas.openxmlformats.org/drawingml/2006/main" xmlns:pic="http://schemas.openxmlformats.org/drawingml/2006/picture">
+            <wp:extent cx="5715000" cy="3050177"/>
+            <wp:docPr id="2" name="Picture 2"/>
+            <wp:cNvGraphicFramePr>
+              <a:graphicFrameLocks noChangeAspect="1"/>
+            </wp:cNvGraphicFramePr>
+            <a:graphic>
+              <a:graphicData uri="http://schemas.openxmlformats.org/drawingml/2006/picture">
+                <pic:pic>
+                  <pic:nvPicPr>
+                    <pic:cNvPr id="0" name="grafica_2_frecuencia.png"/>
+                    <pic:cNvPicPr/>
+                  </pic:nvPicPr>
+                  <pic:blipFill>
+                    <a:blip r:embed="rId11"/>
+                    <a:stretch>
+                      <a:fillRect/>
+                    </a:stretch>
+                  </pic:blipFill>
+                  <pic:spPr>
+                    <a:xfrm>
+                      <a:off x="0" y="0"/>
+                      <a:ext cx="5715000" cy="3050177"/>
+                    </a:xfrm>
+                    <a:prstGeom prst="rect"/>
+                  </pic:spPr>
+                </pic:pic>
+              </a:graphicData>
+            </a:graphic>
+          </wp:inline>
+        </w:drawing>
+      </w:r>
+    </w:p>
+    <w:p>
+      <w:pPr>
+        <w:spacing w:after="240"/>
+      </w:pPr>
+      <w:r>
+        <w:rPr>
+          <w:b/>
+        </w:rPr>
+        <w:t xml:space="preserve">Interpretación: </w:t>
+      </w:r>
+      <w:r>
+        <w:t>La mayoría de clientes realiza entre 2 y 10 compras; el grupo de 11 a 15 compras representa clientes de alta actividad.</w:t>
+      </w:r>
+    </w:p>
+    <w:p>
+      <w:pPr>
+        <w:pStyle w:val="Heading2"/>
+        <w:keepNext/>
+      </w:pPr>
+      <w:r>
+        <w:t>Figura 3. Categoría preferida</w:t>
+      </w:r>
+    </w:p>
+    <w:p>
+      <w:pPr>
+        <w:spacing w:after="120"/>
+        <w:jc w:val="center"/>
+      </w:pPr>
+      <w:r>
+        <w:drawing>
+          <wp:inline xmlns:a="http://schemas.openxmlformats.org/drawingml/2006/main" xmlns:pic="http://schemas.openxmlformats.org/drawingml/2006/picture">
+            <wp:extent cx="5715000" cy="3046695"/>
+            <wp:docPr id="3" name="Picture 3"/>
+            <wp:cNvGraphicFramePr>
+              <a:graphicFrameLocks noChangeAspect="1"/>
+            </wp:cNvGraphicFramePr>
+            <a:graphic>
+              <a:graphicData uri="http://schemas.openxmlformats.org/drawingml/2006/picture">
+                <pic:pic>
+                  <pic:nvPicPr>
+                    <pic:cNvPr id="0" name="grafica_3_categoria.png"/>
+                    <pic:cNvPicPr/>
+                  </pic:nvPicPr>
+                  <pic:blipFill>
+                    <a:blip r:embed="rId12"/>
+                    <a:stretch>
+                      <a:fillRect/>
+                    </a:stretch>
+                  </pic:blipFill>
+                  <pic:spPr>
+                    <a:xfrm>
+                      <a:off x="0" y="0"/>
+                      <a:ext cx="5715000" cy="3046695"/>
+                    </a:xfrm>
+                    <a:prstGeom prst="rect"/>
+                  </pic:spPr>
+                </pic:pic>
+              </a:graphicData>
+            </a:graphic>
+          </wp:inline>
+        </w:drawing>
+      </w:r>
+    </w:p>
+    <w:p>
+      <w:pPr>
+        <w:spacing w:after="240"/>
+      </w:pPr>
+      <w:r>
+        <w:rPr>
+          <w:b/>
+        </w:rPr>
+        <w:t xml:space="preserve">Interpretación: </w:t>
+      </w:r>
+      <w:r>
+        <w:t>Electronics es la categoría más elegida con 17 clientes. Books y Home son las menos populares, con 10 clientes cada una.</w:t>
+      </w:r>
+    </w:p>
+    <w:p>
+      <w:pPr>
+        <w:pStyle w:val="Heading2"/>
+        <w:keepNext/>
+      </w:pPr>
+      <w:r>
+        <w:t>Figura 4. Ingreso mensual y frecuencia de compra</w:t>
+      </w:r>
+    </w:p>
+    <w:p>
+      <w:pPr>
+        <w:spacing w:after="120"/>
+        <w:jc w:val="center"/>
+      </w:pPr>
+      <w:r>
+        <w:drawing>
+          <wp:inline xmlns:a="http://schemas.openxmlformats.org/drawingml/2006/main" xmlns:pic="http://schemas.openxmlformats.org/drawingml/2006/picture">
+            <wp:extent cx="5715000" cy="3122083"/>
+            <wp:docPr id="4" name="Picture 4"/>
+            <wp:cNvGraphicFramePr>
+              <a:graphicFrameLocks noChangeAspect="1"/>
+            </wp:cNvGraphicFramePr>
+            <a:graphic>
+              <a:graphicData uri="http://schemas.openxmlformats.org/drawingml/2006/picture">
+                <pic:pic>
+                  <pic:nvPicPr>
+                    <pic:cNvPr id="0" name="grafica_4_ingreso_frecuencia.png"/>
+                    <pic:cNvPicPr/>
+                  </pic:nvPicPr>
+                  <pic:blipFill>
+                    <a:blip r:embed="rId13"/>
+                    <a:stretch>
+                      <a:fillRect/>
+                    </a:stretch>
+                  </pic:blipFill>
+                  <pic:spPr>
+                    <a:xfrm>
+                      <a:off x="0" y="0"/>
+                      <a:ext cx="5715000" cy="3122083"/>
+                    </a:xfrm>
+                    <a:prstGeom prst="rect"/>
+                  </pic:spPr>
+                </pic:pic>
+              </a:graphicData>
+            </a:graphic>
+          </wp:inline>
+        </w:drawing>
+      </w:r>
+    </w:p>
+    <w:p>
+      <w:pPr>
+        <w:spacing w:after="240"/>
+      </w:pPr>
+      <w:r>
+        <w:rPr>
+          <w:b/>
+        </w:rPr>
+        <w:t xml:space="preserve">Interpretación: </w:t>
+      </w:r>
+      <w:r>
+        <w:t>Existe una relación positiva marcada entre ingreso y frecuencia de compra (r = 0,75), aunque el ingreso no explica por sí solo el comportamiento.</w:t>
+      </w:r>
+    </w:p>
+    <w:p>
+      <w:pPr>
+        <w:pStyle w:val="Heading2"/>
+        <w:keepNext/>
+      </w:pPr>
+      <w:r>
+        <w:t>Figura 5. Visitas al sitio y frecuencia de compra</w:t>
+      </w:r>
+    </w:p>
+    <w:p>
+      <w:pPr>
+        <w:spacing w:after="120"/>
+        <w:jc w:val="center"/>
+      </w:pPr>
+      <w:r>
+        <w:drawing>
+          <wp:inline xmlns:a="http://schemas.openxmlformats.org/drawingml/2006/main" xmlns:pic="http://schemas.openxmlformats.org/drawingml/2006/picture">
+            <wp:extent cx="5715000" cy="3122083"/>
+            <wp:docPr id="5" name="Picture 5"/>
+            <wp:cNvGraphicFramePr>
+              <a:graphicFrameLocks noChangeAspect="1"/>
+            </wp:cNvGraphicFramePr>
+            <a:graphic>
+              <a:graphicData uri="http://schemas.openxmlformats.org/drawingml/2006/picture">
+                <pic:pic>
+                  <pic:nvPicPr>
+                    <pic:cNvPr id="0" name="grafica_5_visitas_frecuencia.png"/>
+                    <pic:cNvPicPr/>
+                  </pic:nvPicPr>
+                  <pic:blipFill>
+                    <a:blip r:embed="rId14"/>
+                    <a:stretch>
+                      <a:fillRect/>
+                    </a:stretch>
+                  </pic:blipFill>
+                  <pic:spPr>
+                    <a:xfrm>
+                      <a:off x="0" y="0"/>
+                      <a:ext cx="5715000" cy="3122083"/>
+                    </a:xfrm>
+                    <a:prstGeom prst="rect"/>
+                  </pic:spPr>
+                </pic:pic>
+              </a:graphicData>
+            </a:graphic>
+          </wp:inline>
+        </w:drawing>
+      </w:r>
+    </w:p>
+    <w:p>
+      <w:pPr>
+        <w:spacing w:after="240"/>
+      </w:pPr>
+      <w:r>
+        <w:rPr>
+          <w:b/>
+        </w:rPr>
+        <w:t xml:space="preserve">Interpretación: </w:t>
+      </w:r>
+      <w:r>
+        <w:t>La relación es positiva muy fuerte (r = 0,96): las visitas al sitio son una señal relevante de la actividad de compra.</w:t>
+      </w:r>
+    </w:p>
     <w:sectPr>
       <w:footerReference w:type="default" r:id="rId9"/>
       <w:pgSz w:w="12240" w:h="15840"/>
@@ -1368,6 +1701,7 @@
     </w:pPr>
     <w:r>
       <w:rPr>
+        <w:rFonts w:ascii="Arial" w:hAnsi="Arial"/>
         <w:sz w:val="16"/>
       </w:rPr>
       <w:t>DataShop | Unidad 1 – Práctica 2 | Minería de Datos</w:t>

</xml_diff>